<commit_message>
fix: corrige cita apa
</commit_message>
<xml_diff>
--- a/MCDI504/docs/MCDI504_S4_2_GRUPO5.docx
+++ b/MCDI504/docs/MCDI504_S4_2_GRUPO5.docx
@@ -9238,6 +9238,15 @@
       </w:pPr>
       <w:r>
         <w:t>Referencias</w:t>
+      </w:r>
+    </w:p>
+    <w:p>
+      <w:pPr>
+        <w:ind w:left="567" w:hanging="567"/>
+      </w:pPr>
+      <w:r>
+        <w:rPr/>
+        <w:t>Goodfellow, I., Bengio, Y., &amp; Courville, A. (2016). Deep learning. MIT Press. https://www.deeplearningbook.org/</w:t>
       </w:r>
     </w:p>
     <w:p>

</xml_diff>